<commit_message>
Update website and training material
</commit_message>
<xml_diff>
--- a/website/training/SecureObs_Doctor_Prescriber_Training_Manual.docx
+++ b/website/training/SecureObs_Doctor_Prescriber_Training_Manual.docx
@@ -362,7 +362,7 @@
           <w:color w:val="486274"/>
           <w:sz w:val="18"/>
         </w:rPr>
-        <w:t>Version 1.0 • July 2026 • For doctors, prescribers and clinical reviewers</w:t>
+        <w:t>Version 1.1 • September 2026 • For doctors, prescribers and clinical reviewers</w:t>
       </w:r>
     </w:p>
     <w:p>
@@ -811,7 +811,7 @@
                 <w:color w:val="2D4652"/>
                 <w:sz w:val="18"/>
               </w:rPr>
-              <w:t>Use NFC staff card or STAFFCODE/PIN and confirm the correct site and ward.</w:t>
+              <w:t>Use NFC staff card or STAFFCODE/PIN and confirm the correct site and ward. If using temporary access, check the allocation end time and save work when the five-minute warning appears.</w:t>
             </w:r>
           </w:p>
         </w:tc>
@@ -891,7 +891,7 @@
                 <w:color w:val="2D4652"/>
                 <w:sz w:val="18"/>
               </w:rPr>
-              <w:t>Choose the patient and confirm room and hospital number before reviewing or prescribing.</w:t>
+              <w:t>Choose the patient and confirm name, date of birth, room and hospital or NHS number before reviewing or prescribing.</w:t>
             </w:r>
           </w:p>
         </w:tc>
@@ -2455,6 +2455,74 @@
           </w:p>
         </w:tc>
       </w:tr>
+      <w:tr>
+        <w:tc>
+          <w:tcPr>
+            <w:tcW w:type="dxa" w:w="3240"/>
+            <w:shd w:fill="F3F8FA"/>
+            <w:tcBorders>
+              <w:top w:val="single" w:sz="6" w:space="0" w:color="D6E5EC"/>
+              <w:left w:val="single" w:sz="6" w:space="0" w:color="D6E5EC"/>
+              <w:bottom w:val="single" w:sz="6" w:space="0" w:color="D6E5EC"/>
+              <w:right w:val="single" w:sz="6" w:space="0" w:color="D6E5EC"/>
+            </w:tcBorders>
+            <w:tcMar>
+              <w:top w:w="90" w:type="dxa"/>
+              <w:start w:w="120" w:type="dxa"/>
+              <w:bottom w:w="90" w:type="dxa"/>
+              <w:end w:w="120" w:type="dxa"/>
+            </w:tcMar>
+            <w:vAlign w:val="center"/>
+          </w:tcPr>
+          <w:p>
+            <w:pPr>
+              <w:spacing w:after="0"/>
+            </w:pPr>
+            <w:r>
+              <w:rPr>
+                <w:rFonts w:ascii="Arial" w:hAnsi="Arial"/>
+                <w:b/>
+                <w:color w:val="082A58"/>
+                <w:sz w:val="18"/>
+              </w:rPr>
+              <w:t>Desktop documentation</w:t>
+            </w:r>
+          </w:p>
+        </w:tc>
+        <w:tc>
+          <w:tcPr>
+            <w:tcW w:type="dxa" w:w="6048"/>
+            <w:shd w:fill="FFFFFF"/>
+            <w:tcBorders>
+              <w:top w:val="single" w:sz="6" w:space="0" w:color="D6E5EC"/>
+              <w:left w:val="single" w:sz="6" w:space="0" w:color="D6E5EC"/>
+              <w:bottom w:val="single" w:sz="6" w:space="0" w:color="D6E5EC"/>
+              <w:right w:val="single" w:sz="6" w:space="0" w:color="D6E5EC"/>
+            </w:tcBorders>
+            <w:tcMar>
+              <w:top w:w="90" w:type="dxa"/>
+              <w:start w:w="120" w:type="dxa"/>
+              <w:bottom w:w="90" w:type="dxa"/>
+              <w:end w:w="120" w:type="dxa"/>
+            </w:tcMar>
+            <w:vAlign w:val="center"/>
+          </w:tcPr>
+          <w:p>
+            <w:pPr>
+              <w:spacing w:after="0"/>
+            </w:pPr>
+            <w:r>
+              <w:rPr>
+                <w:rFonts w:ascii="Arial" w:hAnsi="Arial"/>
+                <w:b w:val="0"/>
+                <w:color w:val="1F3642"/>
+                <w:sz w:val="18"/>
+              </w:rPr>
+              <w:t>The authorised SecureObs staff website can be used for longer patient notes and care-plan writing. Confirm the selected patient before saving.</w:t>
+            </w:r>
+          </w:p>
+        </w:tc>
+      </w:tr>
     </w:tbl>
     <w:p>
       <w:pPr>
@@ -3231,7 +3299,7 @@
                 <w:color w:val="1F3642"/>
                 <w:sz w:val="18"/>
               </w:rPr>
-              <w:t>Check sync status and retry; alert nurse in charge if time-critical.</w:t>
+              <w:t>Check the named item and failure reason in sync status. Re-authenticate if requested, retry and confirm successful upload; alert the nurse in charge if time-critical.</w:t>
             </w:r>
           </w:p>
         </w:tc>

</xml_diff>